<commit_message>
Sync 2026-10-14 email and deck with the final MAS report
Email body re-copied from the final PDF (adds the liquidity sentence,
'some banks' wording). Deck: same wording on slide 1, actual HOSE value
VND13,732bn on slide 2, and the final report's first three headlines.

Co-Authored-By: Claude Opus 5.5 <noreply@anthropic.com>
Claude-Session: https://claude.ai/code/session_01M7EtkZ1WsWb9Cfy2p8P7GB
</commit_message>
<xml_diff>
--- a/DailyReport_Email_EN_20261014.docx
+++ b/DailyReport_Email_EN_20261014.docx
@@ -361,7 +361,7 @@
                             <w:rFonts w:ascii="Noto Sans" w:hAnsi="Noto Sans" w:cs="Noto Sans"/>
                             <w:lang w:val="en-GB"/>
                           </w:rPr>
-                          <w:t>VN-Index opened at 1,720.9pts (+0.1% DoD) and briefly pushed to its intraday high of 1,722.7pts (+0.2% DoD) in the first minutes. The opening push faded quickly, and the index slid to around 1,710.0pts (-0.5% DoD) by mid-morning, then moved sideways through the lunch break. A small early-afternoon rebound failed, and a second wave of selling from around 13:30, led by the Vingroup stocks, dragged the index to its low of 1,699.2pts (-1.2% DoD) near the ATC. A late bounce lifted the close to 1,704.9pts (-0.8% DoD), keeping the 1,700pts psychological level intact. Capital flows indicate a rotation out of Vingroup-related stocks into cyclical sectors with near-term catalysts, notably steel and fertilizer ahead of the Q3 earnings season, as well as fundamentally stronger banks. Foreign investor activity was consistent with this trend, with net selling concentrated in VIC and VHM, while MBB, STB and HPG recorded net buying.</w:t>
+                          <w:t>VN-Index opened at 1,720.9pts (+0.1% DoD) and briefly pushed to its intraday high of 1,722.7pts (+0.2% DoD) in the first minutes. The opening push faded quickly, and the index slid to around 1,710.0pts (-0.5% DoD) by mid-morning, then moved sideways through the lunch break. A small early-afternoon rebound failed, and a second wave of selling from around 13:30, led by the Vingroup stocks, dragged the index to its low of 1,699.2pts (-1.2% DoD) near the ATC. A late bounce lifted the close to 1,704.9pts (-0.8% DoD), keeping the 1,700pts psychological level intact. Capital flows indicate a rotation out of Vingroup-related stocks into cyclical sectors with near-term catalysts, notably steel and fertilizer ahead of the Q3 earnings season, as well as some banks. Foreign investor activity was consistent with this trend, with net selling concentrated in VIC and VHM, while MBB, STB and HPG recorded net buying.</w:t>
                         </w:r>
                       </w:p>
                       <w:p>
@@ -385,7 +385,7 @@
                             <w:rFonts w:ascii="Noto Sans" w:hAnsi="Noto Sans" w:cs="Noto Sans"/>
                             <w:lang w:val="en-GB"/>
                           </w:rPr>
-                          <w:t>HOSE trading value came to VND13,723bn, above the 1M average of VND12,791bn but below the 6M average of VND15,380bn.</w:t>
+                          <w:t>Liquidity reached 584mn of shares (+4.1% DoD) and value reached 13,732bn (+4.1% DoD).</w:t>
                         </w:r>
                       </w:p>
                       <w:p>

</xml_diff>